<commit_message>
finished hours drafts for March
</commit_message>
<xml_diff>
--- a/flow/20230927_hours/піст-тріодь-03-ГР.docx
+++ b/flow/20230927_hours/піст-тріодь-03-ГР.docx
@@ -1,13 +1,475 @@
 
 <file path=word/document.xml><?xml version="1.0" encoding="utf-8"?>
-<w:document xmlns:wpc="http://schemas.microsoft.com/office/word/2010/wordprocessingCanvas" xmlns:cx="http://schemas.microsoft.com/office/drawing/2014/chartex" xmlns:cx1="http://schemas.microsoft.com/office/drawing/2015/9/8/chartex" xmlns:cx2="http://schemas.microsoft.com/office/drawing/2015/10/21/chartex" xmlns:cx3="http://schemas.microsoft.com/office/drawing/2016/5/9/chartex" xmlns:cx4="http://schemas.microsoft.com/office/drawing/2016/5/10/chartex" xmlns:cx5="http://schemas.microsoft.com/office/drawing/2016/5/11/chartex" xmlns:cx6="http://schemas.microsoft.com/office/drawing/2016/5/12/chartex" xmlns:cx7="http://schemas.microsoft.com/office/drawing/2016/5/13/chartex" xmlns:cx8="http://schemas.microsoft.com/office/drawing/2016/5/14/chartex" xmlns:mc="http://schemas.openxmlformats.org/markup-compatibility/2006" xmlns:aink="http://schemas.microsoft.com/office/drawing/2016/ink" xmlns:am3d="http://schemas.microsoft.com/office/drawing/2017/model3d" xmlns:o="urn:schemas-microsoft-com:office:office" xmlns:oel="http://schemas.microsoft.com/office/2019/extlst" xmlns:r="http://schemas.openxmlformats.org/officeDocument/2006/relationships" xmlns:m="http://schemas.openxmlformats.org/officeDocument/2006/math" xmlns:v="urn:schemas-microsoft-com:vml" xmlns:wp14="http://schemas.microsoft.com/office/word/2010/wordprocessingDrawing" xmlns:wp="http://schemas.openxmlformats.org/drawingml/2006/wordprocessingDrawing" xmlns:w10="urn:schemas-microsoft-com:office:word" xmlns:w="http://schemas.openxmlformats.org/wordprocessingml/2006/main" xmlns:w14="http://schemas.microsoft.com/office/word/2010/wordml" xmlns:w15="http://schemas.microsoft.com/office/word/2012/wordml" xmlns:w16cex="http://schemas.microsoft.com/office/word/2018/wordml/cex" xmlns:w16cid="http://schemas.microsoft.com/office/word/2016/wordml/cid" xmlns:w16="http://schemas.microsoft.com/office/word/2018/wordml" xmlns:w16du="http://schemas.microsoft.com/office/word/2023/wordml/word16du" xmlns:w16sdtdh="http://schemas.microsoft.com/office/word/2020/wordml/sdtdatahash" xmlns:w16se="http://schemas.microsoft.com/office/word/2015/wordml/symex" xmlns:wpg="http://schemas.microsoft.com/office/word/2010/wordprocessingGroup" xmlns:wpi="http://schemas.microsoft.com/office/word/2010/wordprocessingInk" xmlns:wne="http://schemas.microsoft.com/office/word/2006/wordml" xmlns:wps="http://schemas.microsoft.com/office/word/2010/wordprocessingShape" mc:Ignorable="w14 w15 w16se w16cid w16 w16cex w16sdtdh w16du wp14">
+<w:document xmlns:wpc="http://schemas.microsoft.com/office/word/2010/wordprocessingCanvas" xmlns:cx="http://schemas.microsoft.com/office/drawing/2014/chartex" xmlns:cx1="http://schemas.microsoft.com/office/drawing/2015/9/8/chartex" xmlns:cx2="http://schemas.microsoft.com/office/drawing/2015/10/21/chartex" xmlns:cx3="http://schemas.microsoft.com/office/drawing/2016/5/9/chartex" xmlns:cx4="http://schemas.microsoft.com/office/drawing/2016/5/10/chartex" xmlns:cx5="http://schemas.microsoft.com/office/drawing/2016/5/11/chartex" xmlns:cx6="http://schemas.microsoft.com/office/drawing/2016/5/12/chartex" xmlns:cx7="http://schemas.microsoft.com/office/drawing/2016/5/13/chartex" xmlns:cx8="http://schemas.microsoft.com/office/drawing/2016/5/14/chartex" xmlns:mc="http://schemas.openxmlformats.org/markup-compatibility/2006" xmlns:aink="http://schemas.microsoft.com/office/drawing/2016/ink" xmlns:am3d="http://schemas.microsoft.com/office/drawing/2017/model3d" xmlns:o="urn:schemas-microsoft-com:office:office" xmlns:r="http://schemas.openxmlformats.org/officeDocument/2006/relationships" xmlns:m="http://schemas.openxmlformats.org/officeDocument/2006/math" xmlns:v="urn:schemas-microsoft-com:vml" xmlns:wp14="http://schemas.microsoft.com/office/word/2010/wordprocessingDrawing" xmlns:wp="http://schemas.openxmlformats.org/drawingml/2006/wordprocessingDrawing" xmlns:w10="urn:schemas-microsoft-com:office:word" xmlns:w="http://schemas.openxmlformats.org/wordprocessingml/2006/main" xmlns:w14="http://schemas.microsoft.com/office/word/2010/wordml" xmlns:w15="http://schemas.microsoft.com/office/word/2012/wordml" xmlns:w16cex="http://schemas.microsoft.com/office/word/2018/wordml/cex" xmlns:w16cid="http://schemas.microsoft.com/office/word/2016/wordml/cid" xmlns:w16="http://schemas.microsoft.com/office/word/2018/wordml" xmlns:w16sdtdh="http://schemas.microsoft.com/office/word/2020/wordml/sdtdatahash" xmlns:w16se="http://schemas.microsoft.com/office/word/2015/wordml/symex" xmlns:wpg="http://schemas.microsoft.com/office/word/2010/wordprocessingGroup" xmlns:wpi="http://schemas.microsoft.com/office/word/2010/wordprocessingInk" xmlns:wne="http://schemas.microsoft.com/office/word/2006/wordml" xmlns:wps="http://schemas.microsoft.com/office/word/2010/wordprocessingShape" mc:Ignorable="w14 w15 w16se w16cid w16 w16cex w16sdtdh wp14">
   <w:body>
     <w:p>
       <w:pPr>
         <w:pStyle w:val="Heading2"/>
       </w:pPr>
       <w:r>
-        <w:t>3 березня</w:t>
+        <w:t>2</w:t>
+      </w:r>
+      <w:r>
+        <w:t xml:space="preserve"> березня</w:t>
+      </w:r>
+      <w:r>
+        <w:t xml:space="preserve"> – сиропусна неділя</w:t>
+      </w:r>
+    </w:p>
+    <w:p>
+      <w:pPr>
+        <w:spacing w:after="200" w:line="240" w:lineRule="auto"/>
+        <w:rPr>
+          <w:rFonts w:ascii="Times New Roman" w:eastAsia="Times New Roman" w:hAnsi="Times New Roman" w:cs="Times New Roman"/>
+          <w:sz w:val="24"/>
+          <w:szCs w:val="24"/>
+          <w:lang w:eastAsia="uk-UA"/>
+        </w:rPr>
+      </w:pPr>
+      <w:r>
+        <w:rPr>
+          <w:rFonts w:ascii="Times New Roman" w:eastAsia="Times New Roman" w:hAnsi="Times New Roman" w:cs="Times New Roman"/>
+          <w:i/>
+          <w:iCs/>
+          <w:color w:val="FF4400"/>
+          <w:sz w:val="24"/>
+          <w:szCs w:val="24"/>
+          <w:highlight w:val="yellow"/>
+          <w:lang w:eastAsia="uk-UA"/>
+        </w:rPr>
+        <w:t xml:space="preserve">Тропар (г. 8): </w:t>
+      </w:r>
+      <w:r>
+        <w:rPr>
+          <w:rFonts w:ascii="Times New Roman" w:eastAsia="Times New Roman" w:hAnsi="Times New Roman" w:cs="Times New Roman"/>
+          <w:color w:val="333333"/>
+          <w:sz w:val="24"/>
+          <w:szCs w:val="24"/>
+          <w:highlight w:val="yellow"/>
+          <w:lang w:eastAsia="uk-UA"/>
+        </w:rPr>
+        <w:t>З висоти зійшов Ти, Милосердний,* погребення прийняв Ти тридневне,* щоб нас визволити від страстей.* Життя і воскресіння наше,* Господи, слава Тобі.</w:t>
+      </w:r>
+    </w:p>
+    <w:p>
+      <w:r>
+        <w:rPr>
+          <w:rFonts w:ascii="Times New Roman" w:eastAsia="Times New Roman" w:hAnsi="Times New Roman" w:cs="Times New Roman"/>
+          <w:i/>
+          <w:iCs/>
+          <w:color w:val="FF4400"/>
+          <w:sz w:val="24"/>
+          <w:szCs w:val="24"/>
+          <w:lang w:eastAsia="uk-UA"/>
+        </w:rPr>
+        <w:t xml:space="preserve">Кондак (г. 6): </w:t>
+      </w:r>
+      <w:r>
+        <w:rPr>
+          <w:rFonts w:ascii="Times New Roman" w:eastAsia="Times New Roman" w:hAnsi="Times New Roman" w:cs="Times New Roman"/>
+          <w:color w:val="333333"/>
+          <w:sz w:val="24"/>
+          <w:szCs w:val="24"/>
+          <w:lang w:eastAsia="uk-UA"/>
+        </w:rPr>
+        <w:t>Премудрости наставнику, розуму подателю,* немудрих учителю і нищих захиснику,* утверди, врозуми серце моє, Владико.* Ти дай мені слово, Отче Слово,* бо оце устам моїм не забороню, щоб звали Тобі:* Милостивий, помилуй мене, падшого.</w:t>
+      </w:r>
+    </w:p>
+    <w:p>
+      <w:pPr>
+        <w:pStyle w:val="Heading2"/>
+      </w:pPr>
+      <w:r>
+        <w:t>9</w:t>
+      </w:r>
+      <w:r>
+        <w:t xml:space="preserve"> березня</w:t>
+      </w:r>
+      <w:r>
+        <w:t xml:space="preserve"> – неділя 1-ша ВП, православ’я</w:t>
+      </w:r>
+    </w:p>
+    <w:p>
+      <w:pPr>
+        <w:spacing w:after="120" w:line="240" w:lineRule="auto"/>
+        <w:rPr>
+          <w:rFonts w:ascii="Times New Roman" w:eastAsia="Times New Roman" w:hAnsi="Times New Roman" w:cs="Times New Roman"/>
+          <w:sz w:val="24"/>
+          <w:szCs w:val="24"/>
+          <w:lang w:eastAsia="uk-UA"/>
+        </w:rPr>
+      </w:pPr>
+      <w:r>
+        <w:rPr>
+          <w:rFonts w:ascii="Times New Roman" w:eastAsia="Times New Roman" w:hAnsi="Times New Roman" w:cs="Times New Roman"/>
+          <w:i/>
+          <w:iCs/>
+          <w:color w:val="FF4400"/>
+          <w:sz w:val="24"/>
+          <w:szCs w:val="24"/>
+          <w:lang w:eastAsia="uk-UA"/>
+        </w:rPr>
+        <w:t>Тропар</w:t>
+      </w:r>
+      <w:r>
+        <w:rPr>
+          <w:rFonts w:ascii="Times New Roman" w:eastAsia="Times New Roman" w:hAnsi="Times New Roman" w:cs="Times New Roman"/>
+          <w:i/>
+          <w:iCs/>
+          <w:color w:val="FF4400"/>
+          <w:sz w:val="24"/>
+          <w:szCs w:val="24"/>
+          <w:lang w:eastAsia="uk-UA"/>
+        </w:rPr>
+        <w:t xml:space="preserve"> (г. 2):</w:t>
+      </w:r>
+      <w:r>
+        <w:rPr>
+          <w:rFonts w:ascii="Times New Roman" w:eastAsia="Times New Roman" w:hAnsi="Times New Roman" w:cs="Times New Roman"/>
+          <w:color w:val="000000"/>
+          <w:sz w:val="24"/>
+          <w:szCs w:val="24"/>
+          <w:lang w:eastAsia="uk-UA"/>
+        </w:rPr>
+        <w:t xml:space="preserve"> </w:t>
+      </w:r>
+      <w:r>
+        <w:rPr>
+          <w:rFonts w:ascii="Times New Roman" w:eastAsia="Times New Roman" w:hAnsi="Times New Roman" w:cs="Times New Roman"/>
+          <w:color w:val="333333"/>
+          <w:sz w:val="24"/>
+          <w:szCs w:val="24"/>
+          <w:lang w:eastAsia="uk-UA"/>
+        </w:rPr>
+        <w:t>Пречистому образові Твоєму поклоняємося, благий,* просячи прощення прогрішень наших, Христе Боже,* бо волею благоволив єси плоттю зійти на хрест,* щоб ізбавити тих, що їх створив єси, від неволі ворожої.* Тому благодарственно кличемо Тобі:* Ти радістю сповнив усе, Спасе наш, прийшовши спасти світ.</w:t>
+      </w:r>
+    </w:p>
+    <w:p>
+      <w:pPr>
+        <w:rPr>
+          <w:rFonts w:ascii="Times New Roman" w:eastAsia="Times New Roman" w:hAnsi="Times New Roman" w:cs="Times New Roman"/>
+          <w:color w:val="333333"/>
+          <w:sz w:val="24"/>
+          <w:szCs w:val="24"/>
+          <w:lang w:eastAsia="uk-UA"/>
+        </w:rPr>
+      </w:pPr>
+      <w:r>
+        <w:rPr>
+          <w:rFonts w:ascii="Times New Roman" w:eastAsia="Times New Roman" w:hAnsi="Times New Roman" w:cs="Times New Roman"/>
+          <w:i/>
+          <w:iCs/>
+          <w:color w:val="FF4400"/>
+          <w:sz w:val="24"/>
+          <w:szCs w:val="24"/>
+          <w:lang w:eastAsia="uk-UA"/>
+        </w:rPr>
+        <w:t>Кондак (г. 8):</w:t>
+      </w:r>
+      <w:r>
+        <w:rPr>
+          <w:rFonts w:ascii="Times New Roman" w:eastAsia="Times New Roman" w:hAnsi="Times New Roman" w:cs="Times New Roman"/>
+          <w:color w:val="000000"/>
+          <w:lang w:eastAsia="uk-UA"/>
+        </w:rPr>
+        <w:t xml:space="preserve"> </w:t>
+      </w:r>
+      <w:r>
+        <w:rPr>
+          <w:rFonts w:ascii="Times New Roman" w:eastAsia="Times New Roman" w:hAnsi="Times New Roman" w:cs="Times New Roman"/>
+          <w:color w:val="333333"/>
+          <w:sz w:val="24"/>
+          <w:szCs w:val="24"/>
+          <w:lang w:eastAsia="uk-UA"/>
+        </w:rPr>
+        <w:t xml:space="preserve">Неописанне Слово Отче* із </w:t>
+      </w:r>
+      <w:r>
+        <w:rPr>
+          <w:rFonts w:ascii="Times New Roman" w:eastAsia="Times New Roman" w:hAnsi="Times New Roman" w:cs="Times New Roman"/>
+          <w:color w:val="333333"/>
+          <w:sz w:val="24"/>
+          <w:szCs w:val="24"/>
+          <w:lang w:eastAsia="uk-UA"/>
+        </w:rPr>
+        <w:t>т</w:t>
+      </w:r>
+      <w:r>
+        <w:rPr>
+          <w:rFonts w:ascii="Times New Roman" w:eastAsia="Times New Roman" w:hAnsi="Times New Roman" w:cs="Times New Roman"/>
+          <w:color w:val="333333"/>
+          <w:sz w:val="24"/>
+          <w:szCs w:val="24"/>
+          <w:lang w:eastAsia="uk-UA"/>
+        </w:rPr>
+        <w:t>ебе, Богородице, воплоченням описалося* і, осквернений образ у давнє зобразивши,* з божественною добротою з’єднало,* та, ісповідуючи спасіння, ділом і словом ми це являємо.</w:t>
+      </w:r>
+    </w:p>
+    <w:p>
+      <w:pPr>
+        <w:pStyle w:val="Heading2"/>
+      </w:pPr>
+      <w:r>
+        <w:t>16 березня – неділя 2-га ВП</w:t>
+      </w:r>
+    </w:p>
+    <w:p>
+      <w:pPr>
+        <w:spacing w:after="120" w:line="240" w:lineRule="auto"/>
+        <w:rPr>
+          <w:rFonts w:ascii="Times New Roman" w:eastAsia="Times New Roman" w:hAnsi="Times New Roman" w:cs="Times New Roman"/>
+          <w:sz w:val="24"/>
+          <w:szCs w:val="24"/>
+          <w:lang w:eastAsia="uk-UA"/>
+        </w:rPr>
+      </w:pPr>
+      <w:r>
+        <w:rPr>
+          <w:rFonts w:ascii="Times New Roman" w:eastAsia="Times New Roman" w:hAnsi="Times New Roman" w:cs="Times New Roman"/>
+          <w:i/>
+          <w:iCs/>
+          <w:color w:val="FF4400"/>
+          <w:sz w:val="24"/>
+          <w:szCs w:val="24"/>
+          <w:lang w:eastAsia="uk-UA"/>
+        </w:rPr>
+        <w:t>Тропар</w:t>
+      </w:r>
+      <w:r>
+        <w:rPr>
+          <w:rFonts w:ascii="Times New Roman" w:eastAsia="Times New Roman" w:hAnsi="Times New Roman" w:cs="Times New Roman"/>
+          <w:i/>
+          <w:iCs/>
+          <w:color w:val="FF4400"/>
+          <w:sz w:val="24"/>
+          <w:szCs w:val="24"/>
+          <w:lang w:eastAsia="uk-UA"/>
+        </w:rPr>
+        <w:t xml:space="preserve"> (г. 2):</w:t>
+      </w:r>
+      <w:r>
+        <w:rPr>
+          <w:rFonts w:ascii="Times New Roman" w:eastAsia="Times New Roman" w:hAnsi="Times New Roman" w:cs="Times New Roman"/>
+          <w:color w:val="000000"/>
+          <w:sz w:val="24"/>
+          <w:szCs w:val="24"/>
+          <w:lang w:eastAsia="uk-UA"/>
+        </w:rPr>
+        <w:t xml:space="preserve"> </w:t>
+      </w:r>
+      <w:r>
+        <w:rPr>
+          <w:rFonts w:ascii="Times New Roman" w:eastAsia="Times New Roman" w:hAnsi="Times New Roman" w:cs="Times New Roman"/>
+          <w:color w:val="333333"/>
+          <w:sz w:val="24"/>
+          <w:szCs w:val="24"/>
+          <w:lang w:val="en-US" w:eastAsia="uk-UA"/>
+        </w:rPr>
+        <w:t>Lorem</w:t>
+      </w:r>
+      <w:r>
+        <w:rPr>
+          <w:rFonts w:ascii="Times New Roman" w:eastAsia="Times New Roman" w:hAnsi="Times New Roman" w:cs="Times New Roman"/>
+          <w:color w:val="333333"/>
+          <w:sz w:val="24"/>
+          <w:szCs w:val="24"/>
+          <w:lang w:eastAsia="uk-UA"/>
+        </w:rPr>
+        <w:t xml:space="preserve"> </w:t>
+      </w:r>
+      <w:r>
+        <w:rPr>
+          <w:rFonts w:ascii="Times New Roman" w:eastAsia="Times New Roman" w:hAnsi="Times New Roman" w:cs="Times New Roman"/>
+          <w:color w:val="333333"/>
+          <w:sz w:val="24"/>
+          <w:szCs w:val="24"/>
+          <w:lang w:val="en-US" w:eastAsia="uk-UA"/>
+        </w:rPr>
+        <w:t>ipsum</w:t>
+      </w:r>
+    </w:p>
+    <w:p>
+      <w:pPr>
+        <w:rPr>
+          <w:rFonts w:ascii="Times New Roman" w:eastAsia="Times New Roman" w:hAnsi="Times New Roman" w:cs="Times New Roman"/>
+          <w:color w:val="333333"/>
+          <w:sz w:val="24"/>
+          <w:szCs w:val="24"/>
+          <w:lang w:eastAsia="uk-UA"/>
+        </w:rPr>
+      </w:pPr>
+      <w:r>
+        <w:rPr>
+          <w:rFonts w:ascii="Times New Roman" w:eastAsia="Times New Roman" w:hAnsi="Times New Roman" w:cs="Times New Roman"/>
+          <w:i/>
+          <w:iCs/>
+          <w:color w:val="FF4400"/>
+          <w:sz w:val="24"/>
+          <w:szCs w:val="24"/>
+          <w:lang w:eastAsia="uk-UA"/>
+        </w:rPr>
+        <w:t xml:space="preserve">Кондак (г. </w:t>
+      </w:r>
+      <w:r>
+        <w:rPr>
+          <w:rFonts w:ascii="Times New Roman" w:eastAsia="Times New Roman" w:hAnsi="Times New Roman" w:cs="Times New Roman"/>
+          <w:i/>
+          <w:iCs/>
+          <w:color w:val="FF4400"/>
+          <w:sz w:val="24"/>
+          <w:szCs w:val="24"/>
+          <w:lang w:eastAsia="uk-UA"/>
+        </w:rPr>
+        <w:t>4</w:t>
+      </w:r>
+      <w:r>
+        <w:rPr>
+          <w:rFonts w:ascii="Times New Roman" w:eastAsia="Times New Roman" w:hAnsi="Times New Roman" w:cs="Times New Roman"/>
+          <w:i/>
+          <w:iCs/>
+          <w:color w:val="FF4400"/>
+          <w:sz w:val="24"/>
+          <w:szCs w:val="24"/>
+          <w:lang w:eastAsia="uk-UA"/>
+        </w:rPr>
+        <w:t>):</w:t>
+      </w:r>
+      <w:r>
+        <w:rPr>
+          <w:rFonts w:ascii="Times New Roman" w:eastAsia="Times New Roman" w:hAnsi="Times New Roman" w:cs="Times New Roman"/>
+          <w:color w:val="000000"/>
+          <w:lang w:eastAsia="uk-UA"/>
+        </w:rPr>
+        <w:t xml:space="preserve"> </w:t>
+      </w:r>
+      <w:r>
+        <w:rPr>
+          <w:rFonts w:ascii="Times New Roman" w:eastAsia="Times New Roman" w:hAnsi="Times New Roman" w:cs="Times New Roman"/>
+          <w:color w:val="333333"/>
+          <w:sz w:val="24"/>
+          <w:szCs w:val="24"/>
+          <w:lang w:eastAsia="uk-UA"/>
+        </w:rPr>
+        <w:t>Сьогодні настав час для добрих діл,</w:t>
+      </w:r>
+      <w:r>
+        <w:rPr>
+          <w:rFonts w:ascii="Times New Roman" w:eastAsia="Times New Roman" w:hAnsi="Times New Roman" w:cs="Times New Roman"/>
+          <w:color w:val="333333"/>
+          <w:sz w:val="24"/>
+          <w:szCs w:val="24"/>
+          <w:lang w:eastAsia="uk-UA"/>
+        </w:rPr>
+        <w:t>*</w:t>
+      </w:r>
+      <w:r>
+        <w:rPr>
+          <w:rFonts w:ascii="Times New Roman" w:eastAsia="Times New Roman" w:hAnsi="Times New Roman" w:cs="Times New Roman"/>
+          <w:color w:val="333333"/>
+          <w:sz w:val="24"/>
+          <w:szCs w:val="24"/>
+          <w:lang w:eastAsia="uk-UA"/>
+        </w:rPr>
+        <w:t xml:space="preserve"> перед дверима Суду встаньмо в пості,</w:t>
+      </w:r>
+      <w:r>
+        <w:rPr>
+          <w:rFonts w:ascii="Times New Roman" w:eastAsia="Times New Roman" w:hAnsi="Times New Roman" w:cs="Times New Roman"/>
+          <w:color w:val="333333"/>
+          <w:sz w:val="24"/>
+          <w:szCs w:val="24"/>
+          <w:lang w:eastAsia="uk-UA"/>
+        </w:rPr>
+        <w:t>*</w:t>
+      </w:r>
+      <w:r>
+        <w:rPr>
+          <w:rFonts w:ascii="Times New Roman" w:eastAsia="Times New Roman" w:hAnsi="Times New Roman" w:cs="Times New Roman"/>
+          <w:color w:val="333333"/>
+          <w:sz w:val="24"/>
+          <w:szCs w:val="24"/>
+          <w:lang w:eastAsia="uk-UA"/>
+        </w:rPr>
+        <w:t xml:space="preserve"> принесімо сльози каяття і милостиню, взиваючи:</w:t>
+      </w:r>
+      <w:r>
+        <w:rPr>
+          <w:rFonts w:ascii="Times New Roman" w:eastAsia="Times New Roman" w:hAnsi="Times New Roman" w:cs="Times New Roman"/>
+          <w:color w:val="333333"/>
+          <w:sz w:val="24"/>
+          <w:szCs w:val="24"/>
+          <w:lang w:eastAsia="uk-UA"/>
+        </w:rPr>
+        <w:t>*</w:t>
+      </w:r>
+      <w:r>
+        <w:rPr>
+          <w:rFonts w:ascii="Times New Roman" w:eastAsia="Times New Roman" w:hAnsi="Times New Roman" w:cs="Times New Roman"/>
+          <w:color w:val="333333"/>
+          <w:sz w:val="24"/>
+          <w:szCs w:val="24"/>
+          <w:lang w:eastAsia="uk-UA"/>
+        </w:rPr>
+        <w:t xml:space="preserve"> нагрішили ми більше, як піску морського;</w:t>
+      </w:r>
+      <w:r>
+        <w:rPr>
+          <w:rFonts w:ascii="Times New Roman" w:eastAsia="Times New Roman" w:hAnsi="Times New Roman" w:cs="Times New Roman"/>
+          <w:color w:val="333333"/>
+          <w:sz w:val="24"/>
+          <w:szCs w:val="24"/>
+          <w:lang w:eastAsia="uk-UA"/>
+        </w:rPr>
+        <w:t>*</w:t>
+      </w:r>
+      <w:r>
+        <w:rPr>
+          <w:rFonts w:ascii="Times New Roman" w:eastAsia="Times New Roman" w:hAnsi="Times New Roman" w:cs="Times New Roman"/>
+          <w:color w:val="333333"/>
+          <w:sz w:val="24"/>
+          <w:szCs w:val="24"/>
+          <w:lang w:eastAsia="uk-UA"/>
+        </w:rPr>
+        <w:t xml:space="preserve"> але прости, Сотворителю всього,</w:t>
+      </w:r>
+      <w:r>
+        <w:rPr>
+          <w:rFonts w:ascii="Times New Roman" w:eastAsia="Times New Roman" w:hAnsi="Times New Roman" w:cs="Times New Roman"/>
+          <w:color w:val="333333"/>
+          <w:sz w:val="24"/>
+          <w:szCs w:val="24"/>
+          <w:lang w:eastAsia="uk-UA"/>
+        </w:rPr>
+        <w:t>*</w:t>
+      </w:r>
+      <w:r>
+        <w:rPr>
+          <w:rFonts w:ascii="Times New Roman" w:eastAsia="Times New Roman" w:hAnsi="Times New Roman" w:cs="Times New Roman"/>
+          <w:color w:val="333333"/>
+          <w:sz w:val="24"/>
+          <w:szCs w:val="24"/>
+          <w:lang w:eastAsia="uk-UA"/>
+        </w:rPr>
+        <w:t xml:space="preserve"> щоб і нам прийняти нетлінні вінці.</w:t>
+      </w:r>
+      <w:r>
+        <w:rPr>
+          <w:rFonts w:ascii="Times New Roman" w:eastAsia="Times New Roman" w:hAnsi="Times New Roman" w:cs="Times New Roman"/>
+          <w:color w:val="333333"/>
+          <w:sz w:val="24"/>
+          <w:szCs w:val="24"/>
+          <w:vertAlign w:val="superscript"/>
+          <w:lang w:eastAsia="uk-UA"/>
+        </w:rPr>
+        <w:t>[КП]</w:t>
+      </w:r>
+    </w:p>
+    <w:p>
+      <w:pPr>
+        <w:pStyle w:val="Heading2"/>
+      </w:pPr>
+      <w:r>
+        <w:t>23 березня – неділя 3-тя ВП, Хрестопоклінна</w:t>
       </w:r>
     </w:p>
     <w:p>
@@ -91,7 +553,101 @@
         <w:pStyle w:val="Heading2"/>
       </w:pPr>
       <w:r>
-        <w:t>24</w:t>
+        <w:t>30 березня – неділя 4-та ВП, Івана Ліствичника</w:t>
+      </w:r>
+    </w:p>
+    <w:p>
+      <w:pPr>
+        <w:spacing w:before="240" w:after="240"/>
+        <w:ind w:hanging="2"/>
+        <w:jc w:val="both"/>
+        <w:rPr>
+          <w:rFonts w:ascii="Times New Roman" w:eastAsia="Times New Roman" w:hAnsi="Times New Roman" w:cs="Times New Roman"/>
+          <w:color w:val="333333"/>
+          <w:sz w:val="24"/>
+          <w:szCs w:val="24"/>
+        </w:rPr>
+      </w:pPr>
+      <w:r>
+        <w:rPr>
+          <w:rFonts w:ascii="Times New Roman" w:eastAsia="Times New Roman" w:hAnsi="Times New Roman" w:cs="Times New Roman"/>
+          <w:i/>
+          <w:color w:val="FF4400"/>
+          <w:sz w:val="24"/>
+          <w:szCs w:val="24"/>
+        </w:rPr>
+        <w:t>Тропар преподобному</w:t>
+      </w:r>
+      <w:r>
+        <w:rPr>
+          <w:rFonts w:ascii="Times New Roman" w:eastAsia="Times New Roman" w:hAnsi="Times New Roman" w:cs="Times New Roman"/>
+          <w:i/>
+          <w:color w:val="FF0000"/>
+          <w:sz w:val="24"/>
+          <w:szCs w:val="24"/>
+        </w:rPr>
+        <w:t xml:space="preserve"> </w:t>
+      </w:r>
+      <w:r>
+        <w:rPr>
+          <w:rFonts w:ascii="Times New Roman" w:eastAsia="Times New Roman" w:hAnsi="Times New Roman" w:cs="Times New Roman"/>
+          <w:i/>
+          <w:color w:val="FF4400"/>
+          <w:sz w:val="24"/>
+          <w:szCs w:val="24"/>
+        </w:rPr>
+        <w:t>(г. 1):</w:t>
+      </w:r>
+      <w:r>
+        <w:rPr>
+          <w:rFonts w:ascii="Times New Roman" w:eastAsia="Times New Roman" w:hAnsi="Times New Roman" w:cs="Times New Roman"/>
+          <w:color w:val="333333"/>
+          <w:sz w:val="24"/>
+          <w:szCs w:val="24"/>
+        </w:rPr>
+        <w:t xml:space="preserve"> Пустинним жителем і в тілі ангелом,* і чудотворцем показав ти себе, богоносний отче наш Іване.* Постом, чуванням, молитвою небесні дарування прийнявши,* зціляєш недужих і душі, що з вірою прибігають до тебе.* Слава Тому, що дав тобі кріпость,* слава Тому, що вінчав тебе,* слава Тому, що діє тобою всім зцілення.</w:t>
+      </w:r>
+    </w:p>
+    <w:p>
+      <w:pPr>
+        <w:spacing w:before="240" w:after="240"/>
+        <w:ind w:hanging="2"/>
+        <w:jc w:val="both"/>
+        <w:rPr>
+          <w:rFonts w:ascii="Times New Roman" w:eastAsia="Times New Roman" w:hAnsi="Times New Roman" w:cs="Times New Roman"/>
+          <w:color w:val="333333"/>
+          <w:sz w:val="24"/>
+          <w:szCs w:val="24"/>
+        </w:rPr>
+      </w:pPr>
+      <w:r>
+        <w:rPr>
+          <w:rFonts w:ascii="Times New Roman" w:eastAsia="Times New Roman" w:hAnsi="Times New Roman" w:cs="Times New Roman"/>
+          <w:i/>
+          <w:color w:val="FF4400"/>
+          <w:sz w:val="24"/>
+          <w:szCs w:val="24"/>
+        </w:rPr>
+        <w:t>Кондак преподобному (г. 4):</w:t>
+      </w:r>
+      <w:r>
+        <w:rPr>
+          <w:rFonts w:ascii="Times New Roman" w:eastAsia="Times New Roman" w:hAnsi="Times New Roman" w:cs="Times New Roman"/>
+          <w:color w:val="333333"/>
+          <w:sz w:val="24"/>
+          <w:szCs w:val="24"/>
+        </w:rPr>
+        <w:t xml:space="preserve"> На висоті правдивої повздержности* Господь Тебе поставив, як звізду необманну,* що просвічує світокраї,* наставнику Іване, отче наш.</w:t>
+      </w:r>
+    </w:p>
+    <w:p/>
+    <w:p/>
+    <w:p>
+      <w:pPr>
+        <w:pStyle w:val="Heading2"/>
+      </w:pPr>
+      <w:r>
+        <w:t>31</w:t>
       </w:r>
       <w:r>
         <w:t xml:space="preserve"> березня</w:t>
@@ -99,70 +655,61 @@
     </w:p>
     <w:p>
       <w:pPr>
-        <w:spacing w:line="240" w:lineRule="auto"/>
-        <w:jc w:val="both"/>
-        <w:rPr>
-          <w:rFonts w:ascii="Times New Roman" w:eastAsia="Times New Roman" w:hAnsi="Times New Roman" w:cs="Times New Roman"/>
-          <w:sz w:val="24"/>
-          <w:szCs w:val="24"/>
-        </w:rPr>
-      </w:pPr>
-      <w:r>
-        <w:rPr>
-          <w:rFonts w:ascii="Times New Roman" w:eastAsia="Times New Roman" w:hAnsi="Times New Roman" w:cs="Times New Roman"/>
-          <w:i/>
-          <w:color w:val="FF4400"/>
-          <w:sz w:val="24"/>
-          <w:szCs w:val="24"/>
-        </w:rPr>
-        <w:t>Тропар (г. 4)</w:t>
-      </w:r>
-      <w:r>
-        <w:rPr>
-          <w:rFonts w:ascii="Times New Roman" w:eastAsia="Times New Roman" w:hAnsi="Times New Roman" w:cs="Times New Roman"/>
-          <w:i/>
-          <w:color w:val="FF0000"/>
-          <w:sz w:val="24"/>
-          <w:szCs w:val="24"/>
-        </w:rPr>
-        <w:t>:</w:t>
-      </w:r>
-      <w:r>
-        <w:rPr>
-          <w:rFonts w:ascii="Times New Roman" w:eastAsia="Times New Roman" w:hAnsi="Times New Roman" w:cs="Times New Roman"/>
-          <w:sz w:val="24"/>
-          <w:szCs w:val="24"/>
-        </w:rPr>
-        <w:t xml:space="preserve"> Погребавши себе разом з Тобою через хрещення, Христе Боже наш,* сподобилися ми безсмертного життя через Твоє воскресіння* і, заспівуючи, кличемо: Осанна в вишніх,* благословен, хто йде в ім’я Господнє.</w:t>
-      </w:r>
-    </w:p>
-    <w:p>
-      <w:pPr>
-        <w:spacing w:line="240" w:lineRule="auto"/>
-        <w:jc w:val="both"/>
-        <w:rPr>
-          <w:rFonts w:ascii="Times New Roman" w:eastAsia="Times New Roman" w:hAnsi="Times New Roman" w:cs="Times New Roman"/>
-          <w:sz w:val="24"/>
-          <w:szCs w:val="24"/>
-        </w:rPr>
-      </w:pPr>
-      <w:r>
-        <w:rPr>
-          <w:rFonts w:ascii="Times New Roman" w:eastAsia="Times New Roman" w:hAnsi="Times New Roman" w:cs="Times New Roman"/>
-          <w:i/>
-          <w:color w:val="FF4400"/>
-          <w:sz w:val="24"/>
-          <w:szCs w:val="24"/>
-        </w:rPr>
-        <w:t>Кондак (г. 6):</w:t>
-      </w:r>
-      <w:r>
-        <w:rPr>
-          <w:rFonts w:ascii="Times New Roman" w:eastAsia="Times New Roman" w:hAnsi="Times New Roman" w:cs="Times New Roman"/>
-          <w:sz w:val="24"/>
-          <w:szCs w:val="24"/>
-        </w:rPr>
-        <w:t xml:space="preserve"> На престолі на небі, на жереб’яті на землі* Тебе носять, Христе Боже;* ангелів хваління і дітей оспівування прийняв Ти;* вони кликали до Тебе:* Благословенний Ти, що йдеш Адама призвати.</w:t>
+        <w:spacing w:after="200" w:line="240" w:lineRule="auto"/>
+        <w:rPr>
+          <w:rFonts w:ascii="Times New Roman" w:eastAsia="Times New Roman" w:hAnsi="Times New Roman" w:cs="Times New Roman"/>
+          <w:sz w:val="24"/>
+          <w:szCs w:val="24"/>
+          <w:lang w:eastAsia="uk-UA"/>
+        </w:rPr>
+      </w:pPr>
+      <w:r>
+        <w:rPr>
+          <w:rFonts w:ascii="Times New Roman" w:eastAsia="Times New Roman" w:hAnsi="Times New Roman" w:cs="Times New Roman"/>
+          <w:i/>
+          <w:iCs/>
+          <w:color w:val="FF4400"/>
+          <w:sz w:val="24"/>
+          <w:szCs w:val="24"/>
+          <w:highlight w:val="yellow"/>
+          <w:lang w:eastAsia="uk-UA"/>
+        </w:rPr>
+        <w:t>Тропар (г. 2):</w:t>
+      </w:r>
+      <w:r>
+        <w:rPr>
+          <w:rFonts w:ascii="Times New Roman" w:eastAsia="Times New Roman" w:hAnsi="Times New Roman" w:cs="Times New Roman"/>
+          <w:color w:val="333333"/>
+          <w:sz w:val="24"/>
+          <w:szCs w:val="24"/>
+          <w:highlight w:val="yellow"/>
+          <w:lang w:eastAsia="uk-UA"/>
+        </w:rPr>
+        <w:t xml:space="preserve"> Коли зійшов Ти до смерти, Життя безсмертне,* тоді ад умертвив Ти блистінням божества.* Коли ж і умерлих із глибин підземних воскресив Ти,* всі сили небесні взивали:* Життєдавче, Христе Боже наш, слава Тобі.</w:t>
+      </w:r>
+    </w:p>
+    <w:p>
+      <w:r>
+        <w:rPr>
+          <w:rFonts w:ascii="Times New Roman" w:eastAsia="Times New Roman" w:hAnsi="Times New Roman" w:cs="Times New Roman"/>
+          <w:i/>
+          <w:iCs/>
+          <w:color w:val="FF4400"/>
+          <w:sz w:val="24"/>
+          <w:szCs w:val="24"/>
+          <w:lang w:eastAsia="uk-UA"/>
+        </w:rPr>
+        <w:t>Кондак (г. 4):</w:t>
+      </w:r>
+      <w:r>
+        <w:rPr>
+          <w:rFonts w:ascii="Times New Roman" w:eastAsia="Times New Roman" w:hAnsi="Times New Roman" w:cs="Times New Roman"/>
+          <w:color w:val="333333"/>
+          <w:sz w:val="24"/>
+          <w:szCs w:val="24"/>
+          <w:lang w:eastAsia="uk-UA"/>
+        </w:rPr>
+        <w:t xml:space="preserve"> Нині час для діяння явився,* при дверях суд,* востаньмо, отже, постячись,* принесім сльози благання з милостинями, взиваючи:* Ми согрішили більше піску морського,* але ослаби, Творче всіх, щоб ми прийняли нетлінні вінці.</w:t>
       </w:r>
     </w:p>
     <w:sectPr>
@@ -176,7 +723,7 @@
 </file>
 
 <file path=word/styles.xml><?xml version="1.0" encoding="utf-8"?>
-<w:styles xmlns:mc="http://schemas.openxmlformats.org/markup-compatibility/2006" xmlns:r="http://schemas.openxmlformats.org/officeDocument/2006/relationships" xmlns:w="http://schemas.openxmlformats.org/wordprocessingml/2006/main" xmlns:w14="http://schemas.microsoft.com/office/word/2010/wordml" xmlns:w15="http://schemas.microsoft.com/office/word/2012/wordml" xmlns:w16cex="http://schemas.microsoft.com/office/word/2018/wordml/cex" xmlns:w16cid="http://schemas.microsoft.com/office/word/2016/wordml/cid" xmlns:w16="http://schemas.microsoft.com/office/word/2018/wordml" xmlns:w16du="http://schemas.microsoft.com/office/word/2023/wordml/word16du" xmlns:w16sdtdh="http://schemas.microsoft.com/office/word/2020/wordml/sdtdatahash" xmlns:w16se="http://schemas.microsoft.com/office/word/2015/wordml/symex" mc:Ignorable="w14 w15 w16se w16cid w16 w16cex w16sdtdh w16du">
+<w:styles xmlns:mc="http://schemas.openxmlformats.org/markup-compatibility/2006" xmlns:r="http://schemas.openxmlformats.org/officeDocument/2006/relationships" xmlns:w="http://schemas.openxmlformats.org/wordprocessingml/2006/main" xmlns:w14="http://schemas.microsoft.com/office/word/2010/wordml" xmlns:w15="http://schemas.microsoft.com/office/word/2012/wordml" xmlns:w16cex="http://schemas.microsoft.com/office/word/2018/wordml/cex" xmlns:w16cid="http://schemas.microsoft.com/office/word/2016/wordml/cid" xmlns:w16="http://schemas.microsoft.com/office/word/2018/wordml" xmlns:w16sdtdh="http://schemas.microsoft.com/office/word/2020/wordml/sdtdatahash" xmlns:w16se="http://schemas.microsoft.com/office/word/2015/wordml/symex" mc:Ignorable="w14 w15 w16se w16cid w16 w16cex w16sdtdh">
   <w:docDefaults>
     <w:rPrDefault>
       <w:rPr>

</xml_diff>